<commit_message>
Stage 1 round 2: rebuild design to Kathryn's corrections of 03/09/2026
Panels removed in favour of gold dividers; frame thinned and nine-sliced
so corners never distort; motifs thickened to match; cream entry boxes
with black text and white button text everywhere; her per-season colour
assignments including olive Autumn and forest-green Winter; Save Backup
& Exit as a critical top-right dual-action button replacing the backup
banner (PLAN.md updated); full-width scrolling This Month list with
highlight-to-edit; documents refitted with the ornate frame on every
page, squiggle dividers, named diary typefaces, and a narrower table.

Co-Authored-By: Claude Fable 5 <noreply@anthropic.com>
Claude-Session: https://claude.ai/code/session_01G2tGcGj8r4C94bbkP9zfJL
</commit_message>
<xml_diff>
--- a/design/samples/Sample-Journal-August-2026.docx
+++ b/design/samples/Sample-Journal-August-2026.docx
@@ -1,138 +1,18 @@
 
 <file path=word/document.xml><?xml version="1.0" encoding="utf-8"?>
 <w:document xmlns:wpc="http://schemas.microsoft.com/office/word/2010/wordprocessingCanvas" xmlns:mc="http://schemas.openxmlformats.org/markup-compatibility/2006" xmlns:o="urn:schemas-microsoft-com:office:office" xmlns:r="http://schemas.openxmlformats.org/officeDocument/2006/relationships" xmlns:m="http://schemas.openxmlformats.org/officeDocument/2006/math" xmlns:v="urn:schemas-microsoft-com:vml" xmlns:wp14="http://schemas.microsoft.com/office/word/2010/wordprocessingDrawing" xmlns:wp="http://schemas.openxmlformats.org/drawingml/2006/wordprocessingDrawing" xmlns:w10="urn:schemas-microsoft-com:office:word" xmlns:w="http://schemas.openxmlformats.org/wordprocessingml/2006/main" xmlns:w14="http://schemas.microsoft.com/office/word/2010/wordml" xmlns:w15="http://schemas.microsoft.com/office/word/2012/wordml" xmlns:wpg="http://schemas.microsoft.com/office/word/2010/wordprocessingGroup" xmlns:wpi="http://schemas.microsoft.com/office/word/2010/wordprocessingInk" xmlns:wne="http://schemas.microsoft.com/office/word/2006/wordml" xmlns:wps="http://schemas.microsoft.com/office/word/2010/wordprocessingShape" xmlns:cx="http://schemas.microsoft.com/office/drawing/2014/chartex" xmlns:cx1="http://schemas.microsoft.com/office/drawing/2015/9/8/chartex" xmlns:cx2="http://schemas.microsoft.com/office/drawing/2015/10/21/chartex" xmlns:cx3="http://schemas.microsoft.com/office/drawing/2016/5/9/chartex" xmlns:cx4="http://schemas.microsoft.com/office/drawing/2016/5/10/chartex" xmlns:cx5="http://schemas.microsoft.com/office/drawing/2016/5/11/chartex" xmlns:cx6="http://schemas.microsoft.com/office/drawing/2016/5/12/chartex" xmlns:cx7="http://schemas.microsoft.com/office/drawing/2016/5/13/chartex" xmlns:cx8="http://schemas.microsoft.com/office/drawing/2016/5/14/chartex" xmlns:aink="http://schemas.microsoft.com/office/drawing/2016/ink" xmlns:am3d="http://schemas.microsoft.com/office/drawing/2017/model3d" xmlns:w16cex="http://schemas.microsoft.com/office/word/2018/wordml/cex" xmlns:w16cid="http://schemas.microsoft.com/office/word/2016/wordml/cid" xmlns:w16="http://schemas.microsoft.com/office/word/2018/wordml" xmlns:w16sdtdh="http://schemas.microsoft.com/office/word/2020/wordml/sdtdatahash" xmlns:w16se="http://schemas.microsoft.com/office/word/2015/wordml/symex" mc:Ignorable="w14 w15 wp14">
-  <w:background w:color="E6D3B6"/>
+  <w:background w:color="FBF6E8"/>
   <w:body>
     <w:p>
       <w:pPr>
-        <w:spacing w:after="0" w:before="120"/>
+        <w:spacing w:after="0" w:before="60"/>
         <w:jc w:val="center"/>
       </w:pPr>
       <w:r>
         <w:drawing>
           <wp:inline distT="0" distB="0" distL="0" distR="0">
-            <wp:extent cx="609600" cy="609600"/>
+            <wp:extent cx="628650" cy="628650"/>
             <wp:effectExtent t="0" r="0" b="0" l="0"/>
-            <wp:docPr id="1" name="" descr="" title=""/>
-            <wp:cNvGraphicFramePr>
-              <a:graphicFrameLocks xmlns:a="http://schemas.openxmlformats.org/drawingml/2006/main" noChangeAspect="1"/>
-            </wp:cNvGraphicFramePr>
-            <a:graphic xmlns:a="http://schemas.openxmlformats.org/drawingml/2006/main">
-              <a:graphicData uri="http://schemas.openxmlformats.org/drawingml/2006/picture">
-                <pic:pic xmlns:pic="http://schemas.openxmlformats.org/drawingml/2006/picture">
-                  <pic:nvPicPr>
-                    <pic:cNvPr id="0" name="" descr=""/>
-                    <pic:cNvPicPr>
-                      <a:picLocks noChangeAspect="1" noChangeArrowheads="1"/>
-                    </pic:cNvPicPr>
-                  </pic:nvPicPr>
-                  <pic:blipFill>
-                    <a:blip r:embed="rId7" cstate="none"/>
-                    <a:srcRect/>
-                    <a:stretch>
-                      <a:fillRect/>
-                    </a:stretch>
-                  </pic:blipFill>
-                  <pic:spPr bwMode="auto">
-                    <a:xfrm>
-                      <a:off x="0" y="0"/>
-                      <a:ext cx="609600" cy="609600"/>
-                    </a:xfrm>
-                    <a:prstGeom prst="rect">
-                      <a:avLst/>
-                    </a:prstGeom>
-                  </pic:spPr>
-                </pic:pic>
-              </a:graphicData>
-            </a:graphic>
-          </wp:inline>
-        </w:drawing>
-      </w:r>
-    </w:p>
-    <w:p>
-      <w:pPr>
-        <w:spacing w:after="0" w:before="60"/>
-        <w:jc w:val="center"/>
-      </w:pPr>
-      <w:r>
-        <w:rPr>
-          <w:rFonts w:ascii="Liberation Serif" w:cs="Liberation Serif" w:eastAsia="Liberation Serif" w:hAnsi="Liberation Serif"/>
-          <w:color w:val="8A7440"/>
-          <w:spacing w:val="60"/>
-          <w:sz w:val="20"/>
-          <w:szCs w:val="20"/>
-        </w:rPr>
-        <w:t xml:space="preserve">MY GARDEN DIARY</w:t>
-      </w:r>
-    </w:p>
-    <w:p>
-      <w:pPr>
-        <w:spacing w:after="60" w:before="40"/>
-        <w:jc w:val="center"/>
-      </w:pPr>
-      <w:r>
-        <w:rPr>
-          <w:rFonts w:ascii="Liberation Serif" w:cs="Liberation Serif" w:eastAsia="Liberation Serif" w:hAnsi="Liberation Serif"/>
-          <w:color w:val="6495ED"/>
-          <w:sz w:val="64"/>
-          <w:szCs w:val="64"/>
-        </w:rPr>
-        <w:t xml:space="preserve">August 2026</w:t>
-      </w:r>
-    </w:p>
-    <w:p>
-      <w:pPr>
-        <w:pBdr>
-          <w:bottom w:val="single" w:color="C9A24D" w:sz="8" w:space="4"/>
-        </w:pBdr>
-        <w:spacing w:after="240"/>
-        <w:jc w:val="center"/>
-      </w:pPr>
-      <w:r>
-        <w:rPr>
-          <w:rFonts w:ascii="Liberation Serif" w:cs="Liberation Serif" w:eastAsia="Liberation Serif" w:hAnsi="Liberation Serif"/>
-          <w:color w:val="3A2F1B"/>
-          <w:sz w:val="8"/>
-          <w:szCs w:val="8"/>
-        </w:rPr>
-        <w:t xml:space="preserve"> </w:t>
-      </w:r>
-    </w:p>
-    <w:p>
-      <w:pPr>
-        <w:pBdr>
-          <w:bottom w:val="single" w:color="C9A24D" w:sz="4" w:space="2"/>
-        </w:pBdr>
-        <w:spacing w:after="100" w:before="320"/>
-      </w:pPr>
-      <w:r>
-        <w:rPr>
-          <w:rFonts w:ascii="Liberation Serif" w:cs="Liberation Serif" w:eastAsia="Liberation Serif" w:hAnsi="Liberation Serif"/>
-          <w:color w:val="6495ED"/>
-          <w:sz w:val="30"/>
-          <w:szCs w:val="30"/>
-        </w:rPr>
-        <w:t xml:space="preserve">Saturday 1 August 2026</w:t>
-      </w:r>
-    </w:p>
-    <w:p>
-      <w:pPr>
-        <w:spacing w:after="140"/>
-        <w:jc w:val="both"/>
-      </w:pPr>
-      <w:r>
-        <w:drawing>
-          <wp:anchor distT="60480" distB="60480" distL="60480" distR="60480" simplePos="0" allowOverlap="1" behindDoc="0" locked="0" layoutInCell="1" relativeHeight="1257300">
-            <wp:simplePos x="0" y="0"/>
-            <wp:positionH relativeFrom="margin">
-              <wp:align>right</wp:align>
-            </wp:positionH>
-            <wp:positionV relativeFrom="paragraph">
-              <wp:posOffset>0</wp:posOffset>
-            </wp:positionV>
-            <wp:extent cx="1676400" cy="1257300"/>
-            <wp:effectExtent t="0" r="0" b="0" l="0"/>
-            <wp:wrapSquare wrapText="left" distT="60480" distB="60480" distL="60480" distR="60480"/>
             <wp:docPr id="1" name="" descr="" title=""/>
             <wp:cNvGraphicFramePr>
               <a:graphicFrameLocks xmlns:a="http://schemas.openxmlformats.org/drawingml/2006/main" noChangeAspect="1"/>
@@ -156,7 +36,7 @@
                   <pic:spPr bwMode="auto">
                     <a:xfrm>
                       <a:off x="0" y="0"/>
-                      <a:ext cx="1676400" cy="1257300"/>
+                      <a:ext cx="628650" cy="628650"/>
                     </a:xfrm>
                     <a:prstGeom prst="rect">
                       <a:avLst/>
@@ -165,37 +45,50 @@
                 </pic:pic>
               </a:graphicData>
             </a:graphic>
-          </wp:anchor>
+          </wp:inline>
         </w:drawing>
       </w:r>
-      <w:r>
-        <w:rPr>
-          <w:rFonts w:ascii="Liberation Serif" w:cs="Liberation Serif" w:eastAsia="Liberation Serif" w:hAnsi="Liberation Serif"/>
-          <w:color w:val="3A2F1B"/>
-          <w:sz w:val="23"/>
-          <w:szCs w:val="23"/>
-        </w:rPr>
-        <w:t xml:space="preserve">A proper harvest morning at last. The courgettes have gone from nothing to glut in a fortnight, as they always do, and the first of the Defenders came in just under two kilos — the best of them from the plant nearest the compost heap, which tells its own story. The beds are drying out fast though, and the water butts are down to the last quarter.</w:t>
-      </w:r>
-    </w:p>
-    <w:p>
-      <w:pPr>
-        <w:spacing w:after="140"/>
-        <w:jc w:val="both"/>
+    </w:p>
+    <w:p>
+      <w:pPr>
+        <w:spacing w:after="40" w:before="40"/>
+        <w:jc w:val="center"/>
+      </w:pPr>
+      <w:r>
+        <w:rPr>
+          <w:rFonts w:ascii="Boecklins Universe" w:cs="Boecklins Universe" w:eastAsia="Boecklins Universe" w:hAnsi="Boecklins Universe"/>
+          <w:color w:val="D2B161"/>
+          <w:sz w:val="40"/>
+          <w:szCs w:val="40"/>
+        </w:rPr>
+        <w:t xml:space="preserve">My Garden Diary</w:t>
+      </w:r>
+    </w:p>
+    <w:p>
+      <w:pPr>
+        <w:spacing w:after="60" w:before="0"/>
+        <w:jc w:val="center"/>
+      </w:pPr>
+      <w:r>
+        <w:rPr>
+          <w:rFonts w:ascii="Glass Antiqua" w:cs="Glass Antiqua" w:eastAsia="Glass Antiqua" w:hAnsi="Glass Antiqua"/>
+          <w:color w:val="6495ED"/>
+          <w:sz w:val="56"/>
+          <w:szCs w:val="56"/>
+        </w:rPr>
+        <w:t xml:space="preserve">August 2026</w:t>
+      </w:r>
+    </w:p>
+    <w:p>
+      <w:pPr>
+        <w:spacing w:after="220"/>
+        <w:jc w:val="center"/>
       </w:pPr>
       <w:r>
         <w:drawing>
-          <wp:anchor distT="60480" distB="60480" distL="60480" distR="60480" simplePos="0" allowOverlap="1" behindDoc="0" locked="0" layoutInCell="1" relativeHeight="1257300">
-            <wp:simplePos x="0" y="0"/>
-            <wp:positionH relativeFrom="margin">
-              <wp:align>left</wp:align>
-            </wp:positionH>
-            <wp:positionV relativeFrom="paragraph">
-              <wp:posOffset>0</wp:posOffset>
-            </wp:positionV>
-            <wp:extent cx="1676400" cy="1257300"/>
+          <wp:inline distT="0" distB="0" distL="0" distR="0">
+            <wp:extent cx="3619500" cy="209550"/>
             <wp:effectExtent t="0" r="0" b="0" l="0"/>
-            <wp:wrapSquare wrapText="right" distT="60480" distB="60480" distL="60480" distR="60480"/>
             <wp:docPr id="1" name="" descr="" title=""/>
             <wp:cNvGraphicFramePr>
               <a:graphicFrameLocks xmlns:a="http://schemas.openxmlformats.org/drawingml/2006/main" noChangeAspect="1"/>
@@ -219,7 +112,7 @@
                   <pic:spPr bwMode="auto">
                     <a:xfrm>
                       <a:off x="0" y="0"/>
-                      <a:ext cx="1676400" cy="1257300"/>
+                      <a:ext cx="3619500" cy="209550"/>
                     </a:xfrm>
                     <a:prstGeom prst="rect">
                       <a:avLst/>
@@ -228,34 +121,67 @@
                 </pic:pic>
               </a:graphicData>
             </a:graphic>
-          </wp:anchor>
+          </wp:inline>
         </w:drawing>
       </w:r>
-      <w:r>
-        <w:rPr>
-          <w:rFonts w:ascii="Liberation Serif" w:cs="Liberation Serif" w:eastAsia="Liberation Serif" w:hAnsi="Liberation Serif"/>
-          <w:color w:val="3A2F1B"/>
-          <w:sz w:val="23"/>
-          <w:szCs w:val="23"/>
-        </w:rPr>
-        <w:t xml:space="preserve">Spent the afternoon tidying the greenhouse staging ready for the late sowings. Found a toad living under the far bench, who was not pleased to be discovered and has been left in peace with my apologies.</w:t>
-      </w:r>
-    </w:p>
-    <w:p>
-      <w:pPr>
-        <w:pBdr>
-          <w:bottom w:val="single" w:color="C9A24D" w:sz="4" w:space="2"/>
-        </w:pBdr>
-        <w:spacing w:after="100" w:before="320"/>
-      </w:pPr>
-      <w:r>
-        <w:rPr>
-          <w:rFonts w:ascii="Liberation Serif" w:cs="Liberation Serif" w:eastAsia="Liberation Serif" w:hAnsi="Liberation Serif"/>
+    </w:p>
+    <w:p>
+      <w:pPr>
+        <w:spacing w:after="20" w:before="300"/>
+      </w:pPr>
+      <w:r>
+        <w:rPr>
+          <w:rFonts w:ascii="Glass Antiqua" w:cs="Glass Antiqua" w:eastAsia="Glass Antiqua" w:hAnsi="Glass Antiqua"/>
           <w:color w:val="6495ED"/>
-          <w:sz w:val="30"/>
-          <w:szCs w:val="30"/>
-        </w:rPr>
-        <w:t xml:space="preserve">Friday 14 August 2026</w:t>
+          <w:sz w:val="32"/>
+          <w:szCs w:val="32"/>
+        </w:rPr>
+        <w:t xml:space="preserve">Saturday 1 August 2026</w:t>
+      </w:r>
+    </w:p>
+    <w:p>
+      <w:pPr>
+        <w:spacing w:after="100"/>
+      </w:pPr>
+      <w:r>
+        <w:drawing>
+          <wp:inline distT="0" distB="0" distL="0" distR="0">
+            <wp:extent cx="2095500" cy="123825"/>
+            <wp:effectExtent t="0" r="0" b="0" l="0"/>
+            <wp:docPr id="1" name="" descr="" title=""/>
+            <wp:cNvGraphicFramePr>
+              <a:graphicFrameLocks xmlns:a="http://schemas.openxmlformats.org/drawingml/2006/main" noChangeAspect="1"/>
+            </wp:cNvGraphicFramePr>
+            <a:graphic xmlns:a="http://schemas.openxmlformats.org/drawingml/2006/main">
+              <a:graphicData uri="http://schemas.openxmlformats.org/drawingml/2006/picture">
+                <pic:pic xmlns:pic="http://schemas.openxmlformats.org/drawingml/2006/picture">
+                  <pic:nvPicPr>
+                    <pic:cNvPr id="0" name="" descr=""/>
+                    <pic:cNvPicPr>
+                      <a:picLocks noChangeAspect="1" noChangeArrowheads="1"/>
+                    </pic:cNvPicPr>
+                  </pic:nvPicPr>
+                  <pic:blipFill>
+                    <a:blip r:embed="rId9" cstate="none"/>
+                    <a:srcRect/>
+                    <a:stretch>
+                      <a:fillRect/>
+                    </a:stretch>
+                  </pic:blipFill>
+                  <pic:spPr bwMode="auto">
+                    <a:xfrm>
+                      <a:off x="0" y="0"/>
+                      <a:ext cx="2095500" cy="123825"/>
+                    </a:xfrm>
+                    <a:prstGeom prst="rect">
+                      <a:avLst/>
+                    </a:prstGeom>
+                  </pic:spPr>
+                </pic:pic>
+              </a:graphicData>
+            </a:graphic>
+          </wp:inline>
+        </w:drawing>
       </w:r>
     </w:p>
     <w:p>
@@ -313,29 +239,12 @@
       </w:r>
       <w:r>
         <w:rPr>
-          <w:rFonts w:ascii="Liberation Serif" w:cs="Liberation Serif" w:eastAsia="Liberation Serif" w:hAnsi="Liberation Serif"/>
-          <w:color w:val="3A2F1B"/>
-          <w:sz w:val="23"/>
-          <w:szCs w:val="23"/>
-        </w:rPr>
-        <w:t xml:space="preserve">Sowed the Arctic King lettuce in the propagator — old seed from two years back, so fingers crossed for germination. The sunflowers by the allotment gate are over eight feet now and the goldfinches have already started on the earliest heads. I had meant to save that seed, but I find I don’t begrudge them it.</w:t>
-      </w:r>
-    </w:p>
-    <w:p>
-      <w:pPr>
-        <w:pBdr>
-          <w:bottom w:val="single" w:color="C9A24D" w:sz="4" w:space="2"/>
-        </w:pBdr>
-        <w:spacing w:after="100" w:before="320"/>
-      </w:pPr>
-      <w:r>
-        <w:rPr>
-          <w:rFonts w:ascii="Liberation Serif" w:cs="Liberation Serif" w:eastAsia="Liberation Serif" w:hAnsi="Liberation Serif"/>
-          <w:color w:val="6495ED"/>
-          <w:sz w:val="30"/>
-          <w:szCs w:val="30"/>
-        </w:rPr>
-        <w:t xml:space="preserve">Saturday 29 August 2026</w:t>
+          <w:rFonts w:ascii="Glass Antiqua" w:cs="Glass Antiqua" w:eastAsia="Glass Antiqua" w:hAnsi="Glass Antiqua"/>
+          <w:color w:val="221E14"/>
+          <w:sz w:val="24"/>
+          <w:szCs w:val="24"/>
+        </w:rPr>
+        <w:t xml:space="preserve">A proper harvest morning at last. The courgettes have gone from nothing to glut in a fortnight, as they always do, and the first of the Defenders came in just under two kilos — the best of them from the plant nearest the compost heap, which tells its own story. The beds are drying out fast though, and the water butts are down to the last quarter.</w:t>
       </w:r>
     </w:p>
     <w:p>
@@ -393,23 +302,262 @@
       </w:r>
       <w:r>
         <w:rPr>
-          <w:rFonts w:ascii="Liberation Serif" w:cs="Liberation Serif" w:eastAsia="Liberation Serif" w:hAnsi="Liberation Serif"/>
-          <w:color w:val="3A2F1B"/>
-          <w:sz w:val="23"/>
-          <w:szCs w:val="23"/>
+          <w:rFonts w:ascii="Glass Antiqua" w:cs="Glass Antiqua" w:eastAsia="Glass Antiqua" w:hAnsi="Glass Antiqua"/>
+          <w:color w:val="221E14"/>
+          <w:sz w:val="24"/>
+          <w:szCs w:val="24"/>
+        </w:rPr>
+        <w:t xml:space="preserve">Spent the afternoon tidying the greenhouse staging ready for the late sowings. Found a toad living under the far bench, who was not pleased to be discovered and has been left in peace with my apologies.</w:t>
+      </w:r>
+    </w:p>
+    <w:p>
+      <w:pPr>
+        <w:spacing w:after="20" w:before="300"/>
+      </w:pPr>
+      <w:r>
+        <w:rPr>
+          <w:rFonts w:ascii="Glass Antiqua" w:cs="Glass Antiqua" w:eastAsia="Glass Antiqua" w:hAnsi="Glass Antiqua"/>
+          <w:color w:val="6495ED"/>
+          <w:sz w:val="32"/>
+          <w:szCs w:val="32"/>
+        </w:rPr>
+        <w:t xml:space="preserve">Friday 14 August 2026</w:t>
+      </w:r>
+    </w:p>
+    <w:p>
+      <w:pPr>
+        <w:spacing w:after="100"/>
+      </w:pPr>
+      <w:r>
+        <w:drawing>
+          <wp:inline distT="0" distB="0" distL="0" distR="0">
+            <wp:extent cx="2095500" cy="123825"/>
+            <wp:effectExtent t="0" r="0" b="0" l="0"/>
+            <wp:docPr id="1" name="" descr="" title=""/>
+            <wp:cNvGraphicFramePr>
+              <a:graphicFrameLocks xmlns:a="http://schemas.openxmlformats.org/drawingml/2006/main" noChangeAspect="1"/>
+            </wp:cNvGraphicFramePr>
+            <a:graphic xmlns:a="http://schemas.openxmlformats.org/drawingml/2006/main">
+              <a:graphicData uri="http://schemas.openxmlformats.org/drawingml/2006/picture">
+                <pic:pic xmlns:pic="http://schemas.openxmlformats.org/drawingml/2006/picture">
+                  <pic:nvPicPr>
+                    <pic:cNvPr id="0" name="" descr=""/>
+                    <pic:cNvPicPr>
+                      <a:picLocks noChangeAspect="1" noChangeArrowheads="1"/>
+                    </pic:cNvPicPr>
+                  </pic:nvPicPr>
+                  <pic:blipFill>
+                    <a:blip r:embed="rId9" cstate="none"/>
+                    <a:srcRect/>
+                    <a:stretch>
+                      <a:fillRect/>
+                    </a:stretch>
+                  </pic:blipFill>
+                  <pic:spPr bwMode="auto">
+                    <a:xfrm>
+                      <a:off x="0" y="0"/>
+                      <a:ext cx="2095500" cy="123825"/>
+                    </a:xfrm>
+                    <a:prstGeom prst="rect">
+                      <a:avLst/>
+                    </a:prstGeom>
+                  </pic:spPr>
+                </pic:pic>
+              </a:graphicData>
+            </a:graphic>
+          </wp:inline>
+        </w:drawing>
+      </w:r>
+    </w:p>
+    <w:p>
+      <w:pPr>
+        <w:spacing w:after="140"/>
+        <w:jc w:val="both"/>
+      </w:pPr>
+      <w:r>
+        <w:drawing>
+          <wp:anchor distT="60480" distB="60480" distL="60480" distR="60480" simplePos="0" allowOverlap="1" behindDoc="0" locked="0" layoutInCell="1" relativeHeight="1257300">
+            <wp:simplePos x="0" y="0"/>
+            <wp:positionH relativeFrom="margin">
+              <wp:align>right</wp:align>
+            </wp:positionH>
+            <wp:positionV relativeFrom="paragraph">
+              <wp:posOffset>0</wp:posOffset>
+            </wp:positionV>
+            <wp:extent cx="1676400" cy="1257300"/>
+            <wp:effectExtent t="0" r="0" b="0" l="0"/>
+            <wp:wrapSquare wrapText="left" distT="60480" distB="60480" distL="60480" distR="60480"/>
+            <wp:docPr id="1" name="" descr="" title=""/>
+            <wp:cNvGraphicFramePr>
+              <a:graphicFrameLocks xmlns:a="http://schemas.openxmlformats.org/drawingml/2006/main" noChangeAspect="1"/>
+            </wp:cNvGraphicFramePr>
+            <a:graphic xmlns:a="http://schemas.openxmlformats.org/drawingml/2006/main">
+              <a:graphicData uri="http://schemas.openxmlformats.org/drawingml/2006/picture">
+                <pic:pic xmlns:pic="http://schemas.openxmlformats.org/drawingml/2006/picture">
+                  <pic:nvPicPr>
+                    <pic:cNvPr id="0" name="" descr=""/>
+                    <pic:cNvPicPr>
+                      <a:picLocks noChangeAspect="1" noChangeArrowheads="1"/>
+                    </pic:cNvPicPr>
+                  </pic:nvPicPr>
+                  <pic:blipFill>
+                    <a:blip r:embed="rId12" cstate="none"/>
+                    <a:srcRect/>
+                    <a:stretch>
+                      <a:fillRect/>
+                    </a:stretch>
+                  </pic:blipFill>
+                  <pic:spPr bwMode="auto">
+                    <a:xfrm>
+                      <a:off x="0" y="0"/>
+                      <a:ext cx="1676400" cy="1257300"/>
+                    </a:xfrm>
+                    <a:prstGeom prst="rect">
+                      <a:avLst/>
+                    </a:prstGeom>
+                  </pic:spPr>
+                </pic:pic>
+              </a:graphicData>
+            </a:graphic>
+          </wp:anchor>
+        </w:drawing>
+      </w:r>
+      <w:r>
+        <w:rPr>
+          <w:rFonts w:ascii="Glass Antiqua" w:cs="Glass Antiqua" w:eastAsia="Glass Antiqua" w:hAnsi="Glass Antiqua"/>
+          <w:color w:val="221E14"/>
+          <w:sz w:val="24"/>
+          <w:szCs w:val="24"/>
+        </w:rPr>
+        <w:t xml:space="preserve">Sowed the Arctic King lettuce in the propagator — old seed from two years back, so fingers crossed for germination. The sunflowers by the allotment gate are over eight feet now and the goldfinches have already started on the earliest heads. I had meant to save that seed, but I find I don’t begrudge them it.</w:t>
+      </w:r>
+    </w:p>
+    <w:p>
+      <w:pPr>
+        <w:spacing w:after="20" w:before="300"/>
+      </w:pPr>
+      <w:r>
+        <w:rPr>
+          <w:rFonts w:ascii="Glass Antiqua" w:cs="Glass Antiqua" w:eastAsia="Glass Antiqua" w:hAnsi="Glass Antiqua"/>
+          <w:color w:val="6495ED"/>
+          <w:sz w:val="32"/>
+          <w:szCs w:val="32"/>
+        </w:rPr>
+        <w:t xml:space="preserve">Saturday 29 August 2026</w:t>
+      </w:r>
+    </w:p>
+    <w:p>
+      <w:pPr>
+        <w:spacing w:after="100"/>
+      </w:pPr>
+      <w:r>
+        <w:drawing>
+          <wp:inline distT="0" distB="0" distL="0" distR="0">
+            <wp:extent cx="2095500" cy="123825"/>
+            <wp:effectExtent t="0" r="0" b="0" l="0"/>
+            <wp:docPr id="1" name="" descr="" title=""/>
+            <wp:cNvGraphicFramePr>
+              <a:graphicFrameLocks xmlns:a="http://schemas.openxmlformats.org/drawingml/2006/main" noChangeAspect="1"/>
+            </wp:cNvGraphicFramePr>
+            <a:graphic xmlns:a="http://schemas.openxmlformats.org/drawingml/2006/main">
+              <a:graphicData uri="http://schemas.openxmlformats.org/drawingml/2006/picture">
+                <pic:pic xmlns:pic="http://schemas.openxmlformats.org/drawingml/2006/picture">
+                  <pic:nvPicPr>
+                    <pic:cNvPr id="0" name="" descr=""/>
+                    <pic:cNvPicPr>
+                      <a:picLocks noChangeAspect="1" noChangeArrowheads="1"/>
+                    </pic:cNvPicPr>
+                  </pic:nvPicPr>
+                  <pic:blipFill>
+                    <a:blip r:embed="rId9" cstate="none"/>
+                    <a:srcRect/>
+                    <a:stretch>
+                      <a:fillRect/>
+                    </a:stretch>
+                  </pic:blipFill>
+                  <pic:spPr bwMode="auto">
+                    <a:xfrm>
+                      <a:off x="0" y="0"/>
+                      <a:ext cx="2095500" cy="123825"/>
+                    </a:xfrm>
+                    <a:prstGeom prst="rect">
+                      <a:avLst/>
+                    </a:prstGeom>
+                  </pic:spPr>
+                </pic:pic>
+              </a:graphicData>
+            </a:graphic>
+          </wp:inline>
+        </w:drawing>
+      </w:r>
+    </w:p>
+    <w:p>
+      <w:pPr>
+        <w:spacing w:after="140"/>
+        <w:jc w:val="both"/>
+      </w:pPr>
+      <w:r>
+        <w:drawing>
+          <wp:anchor distT="60480" distB="60480" distL="60480" distR="60480" simplePos="0" allowOverlap="1" behindDoc="0" locked="0" layoutInCell="1" relativeHeight="1257300">
+            <wp:simplePos x="0" y="0"/>
+            <wp:positionH relativeFrom="margin">
+              <wp:align>left</wp:align>
+            </wp:positionH>
+            <wp:positionV relativeFrom="paragraph">
+              <wp:posOffset>0</wp:posOffset>
+            </wp:positionV>
+            <wp:extent cx="1676400" cy="1257300"/>
+            <wp:effectExtent t="0" r="0" b="0" l="0"/>
+            <wp:wrapSquare wrapText="right" distT="60480" distB="60480" distL="60480" distR="60480"/>
+            <wp:docPr id="1" name="" descr="" title=""/>
+            <wp:cNvGraphicFramePr>
+              <a:graphicFrameLocks xmlns:a="http://schemas.openxmlformats.org/drawingml/2006/main" noChangeAspect="1"/>
+            </wp:cNvGraphicFramePr>
+            <a:graphic xmlns:a="http://schemas.openxmlformats.org/drawingml/2006/main">
+              <a:graphicData uri="http://schemas.openxmlformats.org/drawingml/2006/picture">
+                <pic:pic xmlns:pic="http://schemas.openxmlformats.org/drawingml/2006/picture">
+                  <pic:nvPicPr>
+                    <pic:cNvPr id="0" name="" descr=""/>
+                    <pic:cNvPicPr>
+                      <a:picLocks noChangeAspect="1" noChangeArrowheads="1"/>
+                    </pic:cNvPicPr>
+                  </pic:nvPicPr>
+                  <pic:blipFill>
+                    <a:blip r:embed="rId13" cstate="none"/>
+                    <a:srcRect/>
+                    <a:stretch>
+                      <a:fillRect/>
+                    </a:stretch>
+                  </pic:blipFill>
+                  <pic:spPr bwMode="auto">
+                    <a:xfrm>
+                      <a:off x="0" y="0"/>
+                      <a:ext cx="1676400" cy="1257300"/>
+                    </a:xfrm>
+                    <a:prstGeom prst="rect">
+                      <a:avLst/>
+                    </a:prstGeom>
+                  </pic:spPr>
+                </pic:pic>
+              </a:graphicData>
+            </a:graphic>
+          </wp:anchor>
+        </w:drawing>
+      </w:r>
+      <w:r>
+        <w:rPr>
+          <w:rFonts w:ascii="Glass Antiqua" w:cs="Glass Antiqua" w:eastAsia="Glass Antiqua" w:hAnsi="Glass Antiqua"/>
+          <w:color w:val="221E14"/>
+          <w:sz w:val="24"/>
+          <w:szCs w:val="24"/>
         </w:rPr>
         <w:t xml:space="preserve">Blackberrying along the back hedge with the last of the morning cool — nearly a kilo of them, and the tomatoes and squash coming in besides. The kitchen table looked like a harvest festival by ten o’clock. Made the first crumble of the year and froze the rest. August always ends with purple fingers.</w:t>
       </w:r>
     </w:p>
     <w:sectPr>
+      <w:headerReference w:type="default" r:id="rId7"/>
       <w:pgSz w:w="11906" w:h="16838" w:orient="portrait"/>
-      <w:pgMar w:top="1100" w:right="1250" w:bottom="1100" w:left="1250" w:header="708" w:footer="708" w:gutter="0"/>
-      <w:pgBorders>
-        <w:top w:val="double" w:color="C9A24D" w:sz="18" w:space="18"/>
-        <w:left w:val="double" w:color="C9A24D" w:sz="18" w:space="18"/>
-        <w:bottom w:val="double" w:color="C9A24D" w:sz="18" w:space="18"/>
-        <w:right w:val="double" w:color="C9A24D" w:sz="18" w:space="18"/>
-      </w:pgBorders>
+      <w:pgMar w:top="1250" w:right="1400" w:bottom="1250" w:left="1400" w:header="708" w:footer="708" w:gutter="0"/>
       <w:pgNumType/>
       <w:docGrid w:linePitch="360"/>
     </w:sectPr>
@@ -493,6 +641,61 @@
     </w:p>
   </w:footnote>
 </w:footnotes>
+</file>
+
+<file path=word/header1.xml><?xml version="1.0" encoding="utf-8"?>
+<w:hdr xmlns:wpc="http://schemas.microsoft.com/office/word/2010/wordprocessingCanvas" xmlns:mc="http://schemas.openxmlformats.org/markup-compatibility/2006" xmlns:o="urn:schemas-microsoft-com:office:office" xmlns:r="http://schemas.openxmlformats.org/officeDocument/2006/relationships" xmlns:m="http://schemas.openxmlformats.org/officeDocument/2006/math" xmlns:v="urn:schemas-microsoft-com:vml" xmlns:wp14="http://schemas.microsoft.com/office/word/2010/wordprocessingDrawing" xmlns:wp="http://schemas.openxmlformats.org/drawingml/2006/wordprocessingDrawing" xmlns:w10="urn:schemas-microsoft-com:office:word" xmlns:w="http://schemas.openxmlformats.org/wordprocessingml/2006/main" xmlns:w14="http://schemas.microsoft.com/office/word/2010/wordml" xmlns:w15="http://schemas.microsoft.com/office/word/2012/wordml" xmlns:wpg="http://schemas.microsoft.com/office/word/2010/wordprocessingGroup" xmlns:wpi="http://schemas.microsoft.com/office/word/2010/wordprocessingInk" xmlns:wne="http://schemas.microsoft.com/office/word/2006/wordml" xmlns:wps="http://schemas.microsoft.com/office/word/2010/wordprocessingShape" xmlns:cx="http://schemas.microsoft.com/office/drawing/2014/chartex" xmlns:cx1="http://schemas.microsoft.com/office/drawing/2015/9/8/chartex" xmlns:cx2="http://schemas.microsoft.com/office/drawing/2015/10/21/chartex" xmlns:cx3="http://schemas.microsoft.com/office/drawing/2016/5/9/chartex" xmlns:cx4="http://schemas.microsoft.com/office/drawing/2016/5/10/chartex" xmlns:cx5="http://schemas.microsoft.com/office/drawing/2016/5/11/chartex" xmlns:cx6="http://schemas.microsoft.com/office/drawing/2016/5/12/chartex" xmlns:cx7="http://schemas.microsoft.com/office/drawing/2016/5/13/chartex" xmlns:cx8="http://schemas.microsoft.com/office/drawing/2016/5/14/chartex" xmlns:w16cid="http://schemas.microsoft.com/office/word/2016/wordml/cid" xmlns:w16se="http://schemas.microsoft.com/office/word/2015/wordml/symex">
+  <w:p>
+    <w:r>
+      <w:drawing>
+        <wp:anchor distT="0" distB="0" distL="0" distR="0" simplePos="0" allowOverlap="1" behindDoc="1" locked="0" layoutInCell="1" relativeHeight="10696575">
+          <wp:simplePos x="0" y="0"/>
+          <wp:positionH relativeFrom="page">
+            <wp:posOffset>0</wp:posOffset>
+          </wp:positionH>
+          <wp:positionV relativeFrom="page">
+            <wp:posOffset>0</wp:posOffset>
+          </wp:positionV>
+          <wp:extent cx="7562850" cy="10696575"/>
+          <wp:effectExtent t="0" r="0" b="0" l="0"/>
+          <wp:wrapNone/>
+          <wp:docPr id="1" name="" descr="" title=""/>
+          <wp:cNvGraphicFramePr>
+            <a:graphicFrameLocks xmlns:a="http://schemas.openxmlformats.org/drawingml/2006/main" noChangeAspect="1"/>
+          </wp:cNvGraphicFramePr>
+          <a:graphic xmlns:a="http://schemas.openxmlformats.org/drawingml/2006/main">
+            <a:graphicData uri="http://schemas.openxmlformats.org/drawingml/2006/picture">
+              <pic:pic xmlns:pic="http://schemas.openxmlformats.org/drawingml/2006/picture">
+                <pic:nvPicPr>
+                  <pic:cNvPr id="0" name="" descr=""/>
+                  <pic:cNvPicPr>
+                    <a:picLocks noChangeAspect="1" noChangeArrowheads="1"/>
+                  </pic:cNvPicPr>
+                </pic:nvPicPr>
+                <pic:blipFill>
+                  <a:blip r:embed="rId0" cstate="none"/>
+                  <a:srcRect/>
+                  <a:stretch>
+                    <a:fillRect/>
+                  </a:stretch>
+                </pic:blipFill>
+                <pic:spPr bwMode="auto">
+                  <a:xfrm>
+                    <a:off x="0" y="0"/>
+                    <a:ext cx="7562850" cy="10696575"/>
+                  </a:xfrm>
+                  <a:prstGeom prst="rect">
+                    <a:avLst/>
+                  </a:prstGeom>
+                </pic:spPr>
+              </pic:pic>
+            </a:graphicData>
+          </a:graphic>
+        </wp:anchor>
+      </w:drawing>
+    </w:r>
+  </w:p>
+</w:hdr>
 </file>
 
 <file path=word/numbering.xml><?xml version="1.0" encoding="utf-8"?>
@@ -595,10 +798,10 @@
   <w:docDefaults>
     <w:rPrDefault>
       <w:rPr>
-        <w:rFonts w:ascii="Liberation Serif" w:cs="Liberation Serif" w:eastAsia="Liberation Serif" w:hAnsi="Liberation Serif"/>
-        <w:color w:val="3A2F1B"/>
-        <w:sz w:val="23"/>
-        <w:szCs w:val="23"/>
+        <w:rFonts w:ascii="Glass Antiqua" w:cs="Glass Antiqua" w:eastAsia="Glass Antiqua" w:hAnsi="Glass Antiqua"/>
+        <w:color w:val="221E14"/>
+        <w:sz w:val="24"/>
+        <w:szCs w:val="24"/>
       </w:rPr>
     </w:rPrDefault>
     <w:pPrDefault/>

</xml_diff>

<commit_message>
Stage 1 round 3: centred title, smaller rectangular buttons, one document palette
Backup & Exit renamed and shrunk to one line at top right; date on two
lines and enlarged; all buttons rectangular with rounded corners in the
entry-box idiom; This Month list and buttons pulled clear of the border;
Rust Orange and Deep Plum lightened a step. Documents now keep one
palette in every season (cream, gold, mustard title over seafoam date),
day dividers separate days instead of underlining headings, and the A4
frames are recomposited ornament-aware at print resolution so nothing
stretches or blurs.

Co-Authored-By: Claude Fable 5 <noreply@anthropic.com>
Claude-Session: https://claude.ai/code/session_01G2tGcGj8r4C94bbkP9zfJL
</commit_message>
<xml_diff>
--- a/design/samples/Sample-Journal-August-2026.docx
+++ b/design/samples/Sample-Journal-August-2026.docx
@@ -58,8 +58,8 @@
         <w:rPr>
           <w:rFonts w:ascii="Boecklins Universe" w:cs="Boecklins Universe" w:eastAsia="Boecklins Universe" w:hAnsi="Boecklins Universe"/>
           <w:color w:val="D2B161"/>
-          <w:sz w:val="40"/>
-          <w:szCs w:val="40"/>
+          <w:sz w:val="62"/>
+          <w:szCs w:val="62"/>
         </w:rPr>
         <w:t xml:space="preserve">My Garden Diary</w:t>
       </w:r>
@@ -72,9 +72,9 @@
       <w:r>
         <w:rPr>
           <w:rFonts w:ascii="Glass Antiqua" w:cs="Glass Antiqua" w:eastAsia="Glass Antiqua" w:hAnsi="Glass Antiqua"/>
-          <w:color w:val="6495ED"/>
-          <w:sz w:val="56"/>
-          <w:szCs w:val="56"/>
+          <w:color w:val="A1B5A0"/>
+          <w:sz w:val="46"/>
+          <w:szCs w:val="46"/>
         </w:rPr>
         <w:t xml:space="preserve">August 2026</w:t>
       </w:r>
@@ -127,61 +127,16 @@
     </w:p>
     <w:p>
       <w:pPr>
-        <w:spacing w:after="20" w:before="300"/>
+        <w:spacing w:after="100" w:before="120"/>
       </w:pPr>
       <w:r>
         <w:rPr>
           <w:rFonts w:ascii="Glass Antiqua" w:cs="Glass Antiqua" w:eastAsia="Glass Antiqua" w:hAnsi="Glass Antiqua"/>
-          <w:color w:val="6495ED"/>
+          <w:color w:val="A1B5A0"/>
           <w:sz w:val="32"/>
           <w:szCs w:val="32"/>
         </w:rPr>
         <w:t xml:space="preserve">Saturday 1 August 2026</w:t>
-      </w:r>
-    </w:p>
-    <w:p>
-      <w:pPr>
-        <w:spacing w:after="100"/>
-      </w:pPr>
-      <w:r>
-        <w:drawing>
-          <wp:inline distT="0" distB="0" distL="0" distR="0">
-            <wp:extent cx="2095500" cy="123825"/>
-            <wp:effectExtent t="0" r="0" b="0" l="0"/>
-            <wp:docPr id="1" name="" descr="" title=""/>
-            <wp:cNvGraphicFramePr>
-              <a:graphicFrameLocks xmlns:a="http://schemas.openxmlformats.org/drawingml/2006/main" noChangeAspect="1"/>
-            </wp:cNvGraphicFramePr>
-            <a:graphic xmlns:a="http://schemas.openxmlformats.org/drawingml/2006/main">
-              <a:graphicData uri="http://schemas.openxmlformats.org/drawingml/2006/picture">
-                <pic:pic xmlns:pic="http://schemas.openxmlformats.org/drawingml/2006/picture">
-                  <pic:nvPicPr>
-                    <pic:cNvPr id="0" name="" descr=""/>
-                    <pic:cNvPicPr>
-                      <a:picLocks noChangeAspect="1" noChangeArrowheads="1"/>
-                    </pic:cNvPicPr>
-                  </pic:nvPicPr>
-                  <pic:blipFill>
-                    <a:blip r:embed="rId9" cstate="none"/>
-                    <a:srcRect/>
-                    <a:stretch>
-                      <a:fillRect/>
-                    </a:stretch>
-                  </pic:blipFill>
-                  <pic:spPr bwMode="auto">
-                    <a:xfrm>
-                      <a:off x="0" y="0"/>
-                      <a:ext cx="2095500" cy="123825"/>
-                    </a:xfrm>
-                    <a:prstGeom prst="rect">
-                      <a:avLst/>
-                    </a:prstGeom>
-                  </pic:spPr>
-                </pic:pic>
-              </a:graphicData>
-            </a:graphic>
-          </wp:inline>
-        </w:drawing>
       </w:r>
     </w:p>
     <w:p>
@@ -312,26 +267,13 @@
     </w:p>
     <w:p>
       <w:pPr>
-        <w:spacing w:after="20" w:before="300"/>
-      </w:pPr>
-      <w:r>
-        <w:rPr>
-          <w:rFonts w:ascii="Glass Antiqua" w:cs="Glass Antiqua" w:eastAsia="Glass Antiqua" w:hAnsi="Glass Antiqua"/>
-          <w:color w:val="6495ED"/>
-          <w:sz w:val="32"/>
-          <w:szCs w:val="32"/>
-        </w:rPr>
-        <w:t xml:space="preserve">Friday 14 August 2026</w:t>
-      </w:r>
-    </w:p>
-    <w:p>
-      <w:pPr>
-        <w:spacing w:after="100"/>
+        <w:spacing w:after="120" w:before="200"/>
+        <w:jc w:val="center"/>
       </w:pPr>
       <w:r>
         <w:drawing>
           <wp:inline distT="0" distB="0" distL="0" distR="0">
-            <wp:extent cx="2095500" cy="123825"/>
+            <wp:extent cx="3619500" cy="209550"/>
             <wp:effectExtent t="0" r="0" b="0" l="0"/>
             <wp:docPr id="1" name="" descr="" title=""/>
             <wp:cNvGraphicFramePr>
@@ -356,7 +298,7 @@
                   <pic:spPr bwMode="auto">
                     <a:xfrm>
                       <a:off x="0" y="0"/>
-                      <a:ext cx="2095500" cy="123825"/>
+                      <a:ext cx="3619500" cy="209550"/>
                     </a:xfrm>
                     <a:prstGeom prst="rect">
                       <a:avLst/>
@@ -367,6 +309,20 @@
             </a:graphic>
           </wp:inline>
         </w:drawing>
+      </w:r>
+    </w:p>
+    <w:p>
+      <w:pPr>
+        <w:spacing w:after="100" w:before="120"/>
+      </w:pPr>
+      <w:r>
+        <w:rPr>
+          <w:rFonts w:ascii="Glass Antiqua" w:cs="Glass Antiqua" w:eastAsia="Glass Antiqua" w:hAnsi="Glass Antiqua"/>
+          <w:color w:val="A1B5A0"/>
+          <w:sz w:val="32"/>
+          <w:szCs w:val="32"/>
+        </w:rPr>
+        <w:t xml:space="preserve">Friday 14 August 2026</w:t>
       </w:r>
     </w:p>
     <w:p>
@@ -434,26 +390,13 @@
     </w:p>
     <w:p>
       <w:pPr>
-        <w:spacing w:after="20" w:before="300"/>
-      </w:pPr>
-      <w:r>
-        <w:rPr>
-          <w:rFonts w:ascii="Glass Antiqua" w:cs="Glass Antiqua" w:eastAsia="Glass Antiqua" w:hAnsi="Glass Antiqua"/>
-          <w:color w:val="6495ED"/>
-          <w:sz w:val="32"/>
-          <w:szCs w:val="32"/>
-        </w:rPr>
-        <w:t xml:space="preserve">Saturday 29 August 2026</w:t>
-      </w:r>
-    </w:p>
-    <w:p>
-      <w:pPr>
-        <w:spacing w:after="100"/>
+        <w:spacing w:after="120" w:before="200"/>
+        <w:jc w:val="center"/>
       </w:pPr>
       <w:r>
         <w:drawing>
           <wp:inline distT="0" distB="0" distL="0" distR="0">
-            <wp:extent cx="2095500" cy="123825"/>
+            <wp:extent cx="3619500" cy="209550"/>
             <wp:effectExtent t="0" r="0" b="0" l="0"/>
             <wp:docPr id="1" name="" descr="" title=""/>
             <wp:cNvGraphicFramePr>
@@ -478,7 +421,7 @@
                   <pic:spPr bwMode="auto">
                     <a:xfrm>
                       <a:off x="0" y="0"/>
-                      <a:ext cx="2095500" cy="123825"/>
+                      <a:ext cx="3619500" cy="209550"/>
                     </a:xfrm>
                     <a:prstGeom prst="rect">
                       <a:avLst/>
@@ -489,6 +432,20 @@
             </a:graphic>
           </wp:inline>
         </w:drawing>
+      </w:r>
+    </w:p>
+    <w:p>
+      <w:pPr>
+        <w:spacing w:after="100" w:before="120"/>
+      </w:pPr>
+      <w:r>
+        <w:rPr>
+          <w:rFonts w:ascii="Glass Antiqua" w:cs="Glass Antiqua" w:eastAsia="Glass Antiqua" w:hAnsi="Glass Antiqua"/>
+          <w:color w:val="A1B5A0"/>
+          <w:sz w:val="32"/>
+          <w:szCs w:val="32"/>
+        </w:rPr>
+        <w:t xml:space="preserve">Saturday 29 August 2026</w:t>
       </w:r>
     </w:p>
     <w:p>

</xml_diff>

<commit_message>
Stage 1 round 4: header order, split button alignment, seamless border, clearing dividers
Title centred at top with Backup & Exit beneath; gold divider then a
left-aligned date row with the motif at the left. Add Photos and Update
align left with the boxes, Save and Delete right. Document frames now
take side rails as the full span between corner cuts so junctions are
seamless, and each journal day divider is preceded by a Word clearing
break so it sits centred below both text and photographs.

Co-Authored-By: Claude Fable 5 <noreply@anthropic.com>
Claude-Session: https://claude.ai/code/session_01G2tGcGj8r4C94bbkP9zfJL
</commit_message>
<xml_diff>
--- a/design/samples/Sample-Journal-August-2026.docx
+++ b/design/samples/Sample-Journal-August-2026.docx
@@ -267,7 +267,15 @@
     </w:p>
     <w:p>
       <w:pPr>
-        <w:spacing w:after="120" w:before="200"/>
+        <w:spacing w:after="0" w:before="0"/>
+      </w:pPr>
+      <w:r>
+        <w:br w:type="textWrapping" w:clear="all"/>
+      </w:r>
+    </w:p>
+    <w:p>
+      <w:pPr>
+        <w:spacing w:after="120" w:before="160"/>
         <w:jc w:val="center"/>
       </w:pPr>
       <w:r>
@@ -390,7 +398,15 @@
     </w:p>
     <w:p>
       <w:pPr>
-        <w:spacing w:after="120" w:before="200"/>
+        <w:spacing w:after="0" w:before="0"/>
+      </w:pPr>
+      <w:r>
+        <w:br w:type="textWrapping" w:clear="all"/>
+      </w:r>
+    </w:p>
+    <w:p>
+      <w:pPr>
+        <w:spacing w:after="120" w:before="160"/>
         <w:jc w:val="center"/>
       </w:pPr>
       <w:r>

</xml_diff>